<commit_message>
Point docs to kknandi repository
</commit_message>
<xml_diff>
--- a/reports/MLOps_Assignment1_Report.docx
+++ b/reports/MLOps_Assignment1_Report.docx
@@ -27,7 +27,7 @@
         <w:t>Student:</w:t>
       </w:r>
       <w:r>
-        <w:t xml:space="preserve"> &lt;Your Name&gt; (&lt;BITS ID&gt;) </w:t>
+        <w:t xml:space="preserve"> Kallol Kumar Nandi (2025CT05010) </w:t>
       </w:r>
       <w:r>
         <w:rPr>
@@ -36,7 +36,7 @@
         <w:t>Repository:</w:t>
       </w:r>
       <w:r>
-        <w:t xml:space="preserve"> https://github.com/&lt;your-username&gt;/heart-disease-mlops </w:t>
+        <w:t xml:space="preserve"> https://github.com/kknandi/heart-disease-mlops </w:t>
       </w:r>
       <w:r>
         <w:rPr>
@@ -6063,7 +6063,7 @@
                 <w:b w:val="0"/>
                 <w:sz w:val="18"/>
               </w:rPr>
-              <w:t>ghcr.io/&lt;user&gt;/heart-disease-api:{sha,latest}</w:t>
+              <w:t>ghcr.io/kknandi/heart-disease-api:{sha,latest}</w:t>
             </w:r>
           </w:p>
         </w:tc>
@@ -7968,7 +7968,7 @@
           <w:rFonts w:ascii="Consolas" w:hAnsi="Consolas"/>
           <w:sz w:val="17"/>
         </w:rPr>
-        <w:t>git clone https://github.com/&lt;your-username&gt;/heart-disease-mlops &amp;&amp; cd heart-disease-mlops</w:t>
+        <w:t>git clone https://github.com/kknandi/heart-disease-mlops &amp;&amp; cd heart-disease-mlops</w:t>
         <w:br/>
         <w:t>python -m venv .venv &amp;&amp; .venv\Scripts\activate          # Linux: source .venv/bin/activate</w:t>
         <w:br/>
@@ -8077,7 +8077,7 @@
           <w:rFonts w:ascii="Consolas" w:hAnsi="Consolas"/>
           <w:sz w:val="19"/>
         </w:rPr>
-        <w:t>ghcr.io/&lt;your-username&gt;/heart-disease-api:latest</w:t>
+        <w:t>ghcr.io/kknandi/heart-disease-api:latest</w:t>
       </w:r>
     </w:p>
     <w:sectPr>

</xml_diff>

<commit_message>
Add screenshots and final report
</commit_message>
<xml_diff>
--- a/reports/MLOps_Assignment1_Report.docx
+++ b/reports/MLOps_Assignment1_Report.docx
@@ -4969,12 +4969,42 @@
       </w:r>
     </w:p>
     <w:p>
-      <w:r>
-        <w:rPr>
-          <w:i/>
-          <w:color w:val="C00000"/>
-        </w:rPr>
-        <w:t>[Screenshot pending: ../screenshots/01_mlflow_experiments.png]</w:t>
+      <w:pPr>
+        <w:jc w:val="center"/>
+      </w:pPr>
+      <w:r>
+        <w:drawing>
+          <wp:inline xmlns:a="http://schemas.openxmlformats.org/drawingml/2006/main" xmlns:pic="http://schemas.openxmlformats.org/drawingml/2006/picture">
+            <wp:extent cx="5760720" cy="3024378"/>
+            <wp:docPr id="11" name="Picture 11"/>
+            <wp:cNvGraphicFramePr>
+              <a:graphicFrameLocks noChangeAspect="1"/>
+            </wp:cNvGraphicFramePr>
+            <a:graphic>
+              <a:graphicData uri="http://schemas.openxmlformats.org/drawingml/2006/picture">
+                <pic:pic>
+                  <pic:nvPicPr>
+                    <pic:cNvPr id="0" name="01_mlflow_experiments.png"/>
+                    <pic:cNvPicPr/>
+                  </pic:nvPicPr>
+                  <pic:blipFill>
+                    <a:blip r:embed="rId19"/>
+                    <a:stretch>
+                      <a:fillRect/>
+                    </a:stretch>
+                  </pic:blipFill>
+                  <pic:spPr>
+                    <a:xfrm>
+                      <a:off x="0" y="0"/>
+                      <a:ext cx="5760720" cy="3024378"/>
+                    </a:xfrm>
+                    <a:prstGeom prst="rect"/>
+                  </pic:spPr>
+                </pic:pic>
+              </a:graphicData>
+            </a:graphic>
+          </wp:inline>
+        </w:drawing>
       </w:r>
     </w:p>
     <w:p>
@@ -4990,12 +5020,42 @@
       </w:r>
     </w:p>
     <w:p>
-      <w:r>
-        <w:rPr>
-          <w:i/>
-          <w:color w:val="C00000"/>
-        </w:rPr>
-        <w:t>[Screenshot pending: ../screenshots/02_mlflow_nested_runs.png]</w:t>
+      <w:pPr>
+        <w:jc w:val="center"/>
+      </w:pPr>
+      <w:r>
+        <w:drawing>
+          <wp:inline xmlns:a="http://schemas.openxmlformats.org/drawingml/2006/main" xmlns:pic="http://schemas.openxmlformats.org/drawingml/2006/picture">
+            <wp:extent cx="5760720" cy="3024378"/>
+            <wp:docPr id="12" name="Picture 12"/>
+            <wp:cNvGraphicFramePr>
+              <a:graphicFrameLocks noChangeAspect="1"/>
+            </wp:cNvGraphicFramePr>
+            <a:graphic>
+              <a:graphicData uri="http://schemas.openxmlformats.org/drawingml/2006/picture">
+                <pic:pic>
+                  <pic:nvPicPr>
+                    <pic:cNvPr id="0" name="02_mlflow_nested_runs.png"/>
+                    <pic:cNvPicPr/>
+                  </pic:nvPicPr>
+                  <pic:blipFill>
+                    <a:blip r:embed="rId20"/>
+                    <a:stretch>
+                      <a:fillRect/>
+                    </a:stretch>
+                  </pic:blipFill>
+                  <pic:spPr>
+                    <a:xfrm>
+                      <a:off x="0" y="0"/>
+                      <a:ext cx="5760720" cy="3024378"/>
+                    </a:xfrm>
+                    <a:prstGeom prst="rect"/>
+                  </pic:spPr>
+                </pic:pic>
+              </a:graphicData>
+            </a:graphic>
+          </wp:inline>
+        </w:drawing>
       </w:r>
     </w:p>
     <w:p>
@@ -5011,12 +5071,42 @@
       </w:r>
     </w:p>
     <w:p>
-      <w:r>
-        <w:rPr>
-          <w:i/>
-          <w:color w:val="C00000"/>
-        </w:rPr>
-        <w:t>[Screenshot pending: ../screenshots/05_mlflow_registry.png]</w:t>
+      <w:pPr>
+        <w:jc w:val="center"/>
+      </w:pPr>
+      <w:r>
+        <w:drawing>
+          <wp:inline xmlns:a="http://schemas.openxmlformats.org/drawingml/2006/main" xmlns:pic="http://schemas.openxmlformats.org/drawingml/2006/picture">
+            <wp:extent cx="5760720" cy="3024378"/>
+            <wp:docPr id="13" name="Picture 13"/>
+            <wp:cNvGraphicFramePr>
+              <a:graphicFrameLocks noChangeAspect="1"/>
+            </wp:cNvGraphicFramePr>
+            <a:graphic>
+              <a:graphicData uri="http://schemas.openxmlformats.org/drawingml/2006/picture">
+                <pic:pic>
+                  <pic:nvPicPr>
+                    <pic:cNvPr id="0" name="05_mlflow_registry.png"/>
+                    <pic:cNvPicPr/>
+                  </pic:nvPicPr>
+                  <pic:blipFill>
+                    <a:blip r:embed="rId21"/>
+                    <a:stretch>
+                      <a:fillRect/>
+                    </a:stretch>
+                  </pic:blipFill>
+                  <pic:spPr>
+                    <a:xfrm>
+                      <a:off x="0" y="0"/>
+                      <a:ext cx="5760720" cy="3024378"/>
+                    </a:xfrm>
+                    <a:prstGeom prst="rect"/>
+                  </pic:spPr>
+                </pic:pic>
+              </a:graphicData>
+            </a:graphic>
+          </wp:inline>
+        </w:drawing>
       </w:r>
     </w:p>
     <w:p>
@@ -6124,12 +6214,42 @@
       </w:r>
     </w:p>
     <w:p>
-      <w:r>
-        <w:rPr>
-          <w:i/>
-          <w:color w:val="C00000"/>
-        </w:rPr>
-        <w:t>[Screenshot pending: ../screenshots/07_github_actions.png]</w:t>
+      <w:pPr>
+        <w:jc w:val="center"/>
+      </w:pPr>
+      <w:r>
+        <w:drawing>
+          <wp:inline xmlns:a="http://schemas.openxmlformats.org/drawingml/2006/main" xmlns:pic="http://schemas.openxmlformats.org/drawingml/2006/picture">
+            <wp:extent cx="5760720" cy="3024378"/>
+            <wp:docPr id="14" name="Picture 14"/>
+            <wp:cNvGraphicFramePr>
+              <a:graphicFrameLocks noChangeAspect="1"/>
+            </wp:cNvGraphicFramePr>
+            <a:graphic>
+              <a:graphicData uri="http://schemas.openxmlformats.org/drawingml/2006/picture">
+                <pic:pic>
+                  <pic:nvPicPr>
+                    <pic:cNvPr id="0" name="07_github_actions.png"/>
+                    <pic:cNvPicPr/>
+                  </pic:nvPicPr>
+                  <pic:blipFill>
+                    <a:blip r:embed="rId22"/>
+                    <a:stretch>
+                      <a:fillRect/>
+                    </a:stretch>
+                  </pic:blipFill>
+                  <pic:spPr>
+                    <a:xfrm>
+                      <a:off x="0" y="0"/>
+                      <a:ext cx="5760720" cy="3024378"/>
+                    </a:xfrm>
+                    <a:prstGeom prst="rect"/>
+                  </pic:spPr>
+                </pic:pic>
+              </a:graphicData>
+            </a:graphic>
+          </wp:inline>
+        </w:drawing>
       </w:r>
     </w:p>
     <w:p>
@@ -6145,12 +6265,42 @@
       </w:r>
     </w:p>
     <w:p>
-      <w:r>
-        <w:rPr>
-          <w:i/>
-          <w:color w:val="C00000"/>
-        </w:rPr>
-        <w:t>[Screenshot pending: ../screenshots/08_github_artifacts.png]</w:t>
+      <w:pPr>
+        <w:jc w:val="center"/>
+      </w:pPr>
+      <w:r>
+        <w:drawing>
+          <wp:inline xmlns:a="http://schemas.openxmlformats.org/drawingml/2006/main" xmlns:pic="http://schemas.openxmlformats.org/drawingml/2006/picture">
+            <wp:extent cx="5760720" cy="3024378"/>
+            <wp:docPr id="15" name="Picture 15"/>
+            <wp:cNvGraphicFramePr>
+              <a:graphicFrameLocks noChangeAspect="1"/>
+            </wp:cNvGraphicFramePr>
+            <a:graphic>
+              <a:graphicData uri="http://schemas.openxmlformats.org/drawingml/2006/picture">
+                <pic:pic>
+                  <pic:nvPicPr>
+                    <pic:cNvPr id="0" name="08_github_artifacts.png"/>
+                    <pic:cNvPicPr/>
+                  </pic:nvPicPr>
+                  <pic:blipFill>
+                    <a:blip r:embed="rId23"/>
+                    <a:stretch>
+                      <a:fillRect/>
+                    </a:stretch>
+                  </pic:blipFill>
+                  <pic:spPr>
+                    <a:xfrm>
+                      <a:off x="0" y="0"/>
+                      <a:ext cx="5760720" cy="3024378"/>
+                    </a:xfrm>
+                    <a:prstGeom prst="rect"/>
+                  </pic:spPr>
+                </pic:pic>
+              </a:graphicData>
+            </a:graphic>
+          </wp:inline>
+        </w:drawing>
       </w:r>
     </w:p>
     <w:p>
@@ -6681,12 +6831,42 @@
       </w:r>
     </w:p>
     <w:p>
-      <w:r>
-        <w:rPr>
-          <w:i/>
-          <w:color w:val="C00000"/>
-        </w:rPr>
-        <w:t>[Screenshot pending: ../screenshots/09_docker_build_run.png]</w:t>
+      <w:pPr>
+        <w:jc w:val="center"/>
+      </w:pPr>
+      <w:r>
+        <w:drawing>
+          <wp:inline xmlns:a="http://schemas.openxmlformats.org/drawingml/2006/main" xmlns:pic="http://schemas.openxmlformats.org/drawingml/2006/picture">
+            <wp:extent cx="5760720" cy="4019843"/>
+            <wp:docPr id="16" name="Picture 16"/>
+            <wp:cNvGraphicFramePr>
+              <a:graphicFrameLocks noChangeAspect="1"/>
+            </wp:cNvGraphicFramePr>
+            <a:graphic>
+              <a:graphicData uri="http://schemas.openxmlformats.org/drawingml/2006/picture">
+                <pic:pic>
+                  <pic:nvPicPr>
+                    <pic:cNvPr id="0" name="09_docker_build_run.png"/>
+                    <pic:cNvPicPr/>
+                  </pic:nvPicPr>
+                  <pic:blipFill>
+                    <a:blip r:embed="rId24"/>
+                    <a:stretch>
+                      <a:fillRect/>
+                    </a:stretch>
+                  </pic:blipFill>
+                  <pic:spPr>
+                    <a:xfrm>
+                      <a:off x="0" y="0"/>
+                      <a:ext cx="5760720" cy="4019843"/>
+                    </a:xfrm>
+                    <a:prstGeom prst="rect"/>
+                  </pic:spPr>
+                </pic:pic>
+              </a:graphicData>
+            </a:graphic>
+          </wp:inline>
+        </w:drawing>
       </w:r>
     </w:p>
     <w:p>
@@ -6702,12 +6882,42 @@
       </w:r>
     </w:p>
     <w:p>
-      <w:r>
-        <w:rPr>
-          <w:i/>
-          <w:color w:val="C00000"/>
-        </w:rPr>
-        <w:t>[Screenshot pending: ../screenshots/10_docker_predict.png]</w:t>
+      <w:pPr>
+        <w:jc w:val="center"/>
+      </w:pPr>
+      <w:r>
+        <w:drawing>
+          <wp:inline xmlns:a="http://schemas.openxmlformats.org/drawingml/2006/main" xmlns:pic="http://schemas.openxmlformats.org/drawingml/2006/picture">
+            <wp:extent cx="5760720" cy="541276"/>
+            <wp:docPr id="17" name="Picture 17"/>
+            <wp:cNvGraphicFramePr>
+              <a:graphicFrameLocks noChangeAspect="1"/>
+            </wp:cNvGraphicFramePr>
+            <a:graphic>
+              <a:graphicData uri="http://schemas.openxmlformats.org/drawingml/2006/picture">
+                <pic:pic>
+                  <pic:nvPicPr>
+                    <pic:cNvPr id="0" name="10_docker_predict.png"/>
+                    <pic:cNvPicPr/>
+                  </pic:nvPicPr>
+                  <pic:blipFill>
+                    <a:blip r:embed="rId25"/>
+                    <a:stretch>
+                      <a:fillRect/>
+                    </a:stretch>
+                  </pic:blipFill>
+                  <pic:spPr>
+                    <a:xfrm>
+                      <a:off x="0" y="0"/>
+                      <a:ext cx="5760720" cy="541276"/>
+                    </a:xfrm>
+                    <a:prstGeom prst="rect"/>
+                  </pic:spPr>
+                </pic:pic>
+              </a:graphicData>
+            </a:graphic>
+          </wp:inline>
+        </w:drawing>
       </w:r>
     </w:p>
     <w:p>
@@ -6967,12 +7177,42 @@
       </w:r>
     </w:p>
     <w:p>
-      <w:r>
-        <w:rPr>
-          <w:i/>
-          <w:color w:val="C00000"/>
-        </w:rPr>
-        <w:t>[Screenshot pending: ../screenshots/12_k8s_get_all.png]</w:t>
+      <w:pPr>
+        <w:jc w:val="center"/>
+      </w:pPr>
+      <w:r>
+        <w:drawing>
+          <wp:inline xmlns:a="http://schemas.openxmlformats.org/drawingml/2006/main" xmlns:pic="http://schemas.openxmlformats.org/drawingml/2006/picture">
+            <wp:extent cx="5760720" cy="1790844"/>
+            <wp:docPr id="18" name="Picture 18"/>
+            <wp:cNvGraphicFramePr>
+              <a:graphicFrameLocks noChangeAspect="1"/>
+            </wp:cNvGraphicFramePr>
+            <a:graphic>
+              <a:graphicData uri="http://schemas.openxmlformats.org/drawingml/2006/picture">
+                <pic:pic>
+                  <pic:nvPicPr>
+                    <pic:cNvPr id="0" name="12_k8s_get_all.png"/>
+                    <pic:cNvPicPr/>
+                  </pic:nvPicPr>
+                  <pic:blipFill>
+                    <a:blip r:embed="rId26"/>
+                    <a:stretch>
+                      <a:fillRect/>
+                    </a:stretch>
+                  </pic:blipFill>
+                  <pic:spPr>
+                    <a:xfrm>
+                      <a:off x="0" y="0"/>
+                      <a:ext cx="5760720" cy="1790844"/>
+                    </a:xfrm>
+                    <a:prstGeom prst="rect"/>
+                  </pic:spPr>
+                </pic:pic>
+              </a:graphicData>
+            </a:graphic>
+          </wp:inline>
+        </w:drawing>
       </w:r>
     </w:p>
     <w:p>
@@ -6988,12 +7228,42 @@
       </w:r>
     </w:p>
     <w:p>
-      <w:r>
-        <w:rPr>
-          <w:i/>
-          <w:color w:val="C00000"/>
-        </w:rPr>
-        <w:t>[Screenshot pending: ../screenshots/14_k8s_predict.png]</w:t>
+      <w:pPr>
+        <w:jc w:val="center"/>
+      </w:pPr>
+      <w:r>
+        <w:drawing>
+          <wp:inline xmlns:a="http://schemas.openxmlformats.org/drawingml/2006/main" xmlns:pic="http://schemas.openxmlformats.org/drawingml/2006/picture">
+            <wp:extent cx="5760720" cy="499098"/>
+            <wp:docPr id="19" name="Picture 19"/>
+            <wp:cNvGraphicFramePr>
+              <a:graphicFrameLocks noChangeAspect="1"/>
+            </wp:cNvGraphicFramePr>
+            <a:graphic>
+              <a:graphicData uri="http://schemas.openxmlformats.org/drawingml/2006/picture">
+                <pic:pic>
+                  <pic:nvPicPr>
+                    <pic:cNvPr id="0" name="14_k8s_predict.png"/>
+                    <pic:cNvPicPr/>
+                  </pic:nvPicPr>
+                  <pic:blipFill>
+                    <a:blip r:embed="rId27"/>
+                    <a:stretch>
+                      <a:fillRect/>
+                    </a:stretch>
+                  </pic:blipFill>
+                  <pic:spPr>
+                    <a:xfrm>
+                      <a:off x="0" y="0"/>
+                      <a:ext cx="5760720" cy="499098"/>
+                    </a:xfrm>
+                    <a:prstGeom prst="rect"/>
+                  </pic:spPr>
+                </pic:pic>
+              </a:graphicData>
+            </a:graphic>
+          </wp:inline>
+        </w:drawing>
       </w:r>
     </w:p>
     <w:p>
@@ -7781,12 +8051,42 @@
       </w:r>
     </w:p>
     <w:p>
-      <w:r>
-        <w:rPr>
-          <w:i/>
-          <w:color w:val="C00000"/>
-        </w:rPr>
-        <w:t>[Screenshot pending: ../screenshots/15_prometheus_targets.png]</w:t>
+      <w:pPr>
+        <w:jc w:val="center"/>
+      </w:pPr>
+      <w:r>
+        <w:drawing>
+          <wp:inline xmlns:a="http://schemas.openxmlformats.org/drawingml/2006/main" xmlns:pic="http://schemas.openxmlformats.org/drawingml/2006/picture">
+            <wp:extent cx="5760720" cy="3024378"/>
+            <wp:docPr id="20" name="Picture 20"/>
+            <wp:cNvGraphicFramePr>
+              <a:graphicFrameLocks noChangeAspect="1"/>
+            </wp:cNvGraphicFramePr>
+            <a:graphic>
+              <a:graphicData uri="http://schemas.openxmlformats.org/drawingml/2006/picture">
+                <pic:pic>
+                  <pic:nvPicPr>
+                    <pic:cNvPr id="0" name="15_prometheus_targets.png"/>
+                    <pic:cNvPicPr/>
+                  </pic:nvPicPr>
+                  <pic:blipFill>
+                    <a:blip r:embed="rId28"/>
+                    <a:stretch>
+                      <a:fillRect/>
+                    </a:stretch>
+                  </pic:blipFill>
+                  <pic:spPr>
+                    <a:xfrm>
+                      <a:off x="0" y="0"/>
+                      <a:ext cx="5760720" cy="3024378"/>
+                    </a:xfrm>
+                    <a:prstGeom prst="rect"/>
+                  </pic:spPr>
+                </pic:pic>
+              </a:graphicData>
+            </a:graphic>
+          </wp:inline>
+        </w:drawing>
       </w:r>
     </w:p>
     <w:p>
@@ -7802,12 +8102,42 @@
       </w:r>
     </w:p>
     <w:p>
-      <w:r>
-        <w:rPr>
-          <w:i/>
-          <w:color w:val="C00000"/>
-        </w:rPr>
-        <w:t>[Screenshot pending: ../screenshots/16_grafana_dashboard.png]</w:t>
+      <w:pPr>
+        <w:jc w:val="center"/>
+      </w:pPr>
+      <w:r>
+        <w:drawing>
+          <wp:inline xmlns:a="http://schemas.openxmlformats.org/drawingml/2006/main" xmlns:pic="http://schemas.openxmlformats.org/drawingml/2006/picture">
+            <wp:extent cx="5760720" cy="5018582"/>
+            <wp:docPr id="21" name="Picture 21"/>
+            <wp:cNvGraphicFramePr>
+              <a:graphicFrameLocks noChangeAspect="1"/>
+            </wp:cNvGraphicFramePr>
+            <a:graphic>
+              <a:graphicData uri="http://schemas.openxmlformats.org/drawingml/2006/picture">
+                <pic:pic>
+                  <pic:nvPicPr>
+                    <pic:cNvPr id="0" name="16_grafana_dashboard.png"/>
+                    <pic:cNvPicPr/>
+                  </pic:nvPicPr>
+                  <pic:blipFill>
+                    <a:blip r:embed="rId29"/>
+                    <a:stretch>
+                      <a:fillRect/>
+                    </a:stretch>
+                  </pic:blipFill>
+                  <pic:spPr>
+                    <a:xfrm>
+                      <a:off x="0" y="0"/>
+                      <a:ext cx="5760720" cy="5018582"/>
+                    </a:xfrm>
+                    <a:prstGeom prst="rect"/>
+                  </pic:spPr>
+                </pic:pic>
+              </a:graphicData>
+            </a:graphic>
+          </wp:inline>
+        </w:drawing>
       </w:r>
     </w:p>
     <w:p>
@@ -7823,12 +8153,42 @@
       </w:r>
     </w:p>
     <w:p>
-      <w:r>
-        <w:rPr>
-          <w:i/>
-          <w:color w:val="C00000"/>
-        </w:rPr>
-        <w:t>[Screenshot pending: ../screenshots/17_json_logs.png]</w:t>
+      <w:pPr>
+        <w:jc w:val="center"/>
+      </w:pPr>
+      <w:r>
+        <w:drawing>
+          <wp:inline xmlns:a="http://schemas.openxmlformats.org/drawingml/2006/main" xmlns:pic="http://schemas.openxmlformats.org/drawingml/2006/picture">
+            <wp:extent cx="5760720" cy="3874686"/>
+            <wp:docPr id="22" name="Picture 22"/>
+            <wp:cNvGraphicFramePr>
+              <a:graphicFrameLocks noChangeAspect="1"/>
+            </wp:cNvGraphicFramePr>
+            <a:graphic>
+              <a:graphicData uri="http://schemas.openxmlformats.org/drawingml/2006/picture">
+                <pic:pic>
+                  <pic:nvPicPr>
+                    <pic:cNvPr id="0" name="17_json_logs.png"/>
+                    <pic:cNvPicPr/>
+                  </pic:nvPicPr>
+                  <pic:blipFill>
+                    <a:blip r:embed="rId30"/>
+                    <a:stretch>
+                      <a:fillRect/>
+                    </a:stretch>
+                  </pic:blipFill>
+                  <pic:spPr>
+                    <a:xfrm>
+                      <a:off x="0" y="0"/>
+                      <a:ext cx="5760720" cy="3874686"/>
+                    </a:xfrm>
+                    <a:prstGeom prst="rect"/>
+                  </pic:spPr>
+                </pic:pic>
+              </a:graphicData>
+            </a:graphic>
+          </wp:inline>
+        </w:drawing>
       </w:r>
     </w:p>
     <w:p>

</xml_diff>

<commit_message>
Document CI failure handling with failed-run evidence
</commit_message>
<xml_diff>
--- a/reports/MLOps_Assignment1_Report.docx
+++ b/reports/MLOps_Assignment1_Report.docx
@@ -3838,115 +3838,158 @@
     </w:tbl>
     <w:p/>
     <w:p>
-      <w:pPr>
-        <w:jc w:val="center"/>
-      </w:pPr>
-      <w:r>
-        <w:drawing>
-          <wp:inline xmlns:a="http://schemas.openxmlformats.org/drawingml/2006/main" xmlns:pic="http://schemas.openxmlformats.org/drawingml/2006/picture">
-            <wp:extent cx="5852160" cy="3072384"/>
-            <wp:docPr id="10" name="Picture 10"/>
-            <wp:cNvGraphicFramePr>
-              <a:graphicFrameLocks noChangeAspect="1"/>
-            </wp:cNvGraphicFramePr>
-            <a:graphic>
-              <a:graphicData uri="http://schemas.openxmlformats.org/drawingml/2006/picture">
-                <pic:pic>
-                  <pic:nvPicPr>
-                    <pic:cNvPr id="0" name="07_github_actions.png"/>
-                    <pic:cNvPicPr/>
-                  </pic:nvPicPr>
-                  <pic:blipFill>
-                    <a:blip r:embed="rId18"/>
-                    <a:stretch>
-                      <a:fillRect/>
-                    </a:stretch>
-                  </pic:blipFill>
-                  <pic:spPr>
-                    <a:xfrm>
-                      <a:off x="0" y="0"/>
-                      <a:ext cx="5852160" cy="3072384"/>
-                    </a:xfrm>
-                    <a:prstGeom prst="rect"/>
-                  </pic:spPr>
-                </pic:pic>
-              </a:graphicData>
-            </a:graphic>
-          </wp:inline>
-        </w:drawing>
+      <w:r>
+        <w:rPr>
+          <w:b/>
+        </w:rPr>
+        <w:t>Failure handling.</w:t>
+      </w:r>
+      <w:r>
+        <w:t xml:space="preserve"> To verify that the pipeline fails on errors, I opened a pull request containing a deliberately failing test (Figure 11). The test job failed with exit code 1 and a clear </w:t>
+      </w:r>
+      <w:r>
+        <w:rPr>
+          <w:rFonts w:ascii="Consolas" w:hAnsi="Consolas"/>
+          <w:sz w:val="19"/>
+        </w:rPr>
+        <w:t>AssertionError</w:t>
+      </w:r>
+      <w:r>
+        <w:t xml:space="preserve"> in the log (Figure 14). The train and docker jobs were skipped, so no model or image was produced. The pull request was then closed without merging.</w:t>
       </w:r>
     </w:p>
+    <w:tbl>
+      <w:tblPr>
+        <w:tblW w:type="auto" w:w="0"/>
+        <w:tblLook w:firstColumn="1" w:firstRow="1" w:lastColumn="0" w:lastRow="0" w:noHBand="0" w:noVBand="1" w:val="04A0"/>
+      </w:tblPr>
+      <w:tblGrid>
+        <w:gridCol w:w="5040"/>
+        <w:gridCol w:w="5040"/>
+      </w:tblGrid>
+      <w:tr>
+        <w:tc>
+          <w:tcPr>
+            <w:tcW w:type="dxa" w:w="5040"/>
+          </w:tcPr>
+          <w:p>
+            <w:pPr>
+              <w:jc w:val="center"/>
+            </w:pPr>
+            <w:r>
+              <w:drawing>
+                <wp:inline xmlns:a="http://schemas.openxmlformats.org/drawingml/2006/main" xmlns:pic="http://schemas.openxmlformats.org/drawingml/2006/picture">
+                  <wp:extent cx="3063240" cy="1608201"/>
+                  <wp:docPr id="10" name="Picture 10"/>
+                  <wp:cNvGraphicFramePr>
+                    <a:graphicFrameLocks noChangeAspect="1"/>
+                  </wp:cNvGraphicFramePr>
+                  <a:graphic>
+                    <a:graphicData uri="http://schemas.openxmlformats.org/drawingml/2006/picture">
+                      <pic:pic>
+                        <pic:nvPicPr>
+                          <pic:cNvPr id="0" name="07_github_actions.png"/>
+                          <pic:cNvPicPr/>
+                        </pic:nvPicPr>
+                        <pic:blipFill>
+                          <a:blip r:embed="rId18"/>
+                          <a:stretch>
+                            <a:fillRect/>
+                          </a:stretch>
+                        </pic:blipFill>
+                        <pic:spPr>
+                          <a:xfrm>
+                            <a:off x="0" y="0"/>
+                            <a:ext cx="3063240" cy="1608201"/>
+                          </a:xfrm>
+                          <a:prstGeom prst="rect"/>
+                        </pic:spPr>
+                      </pic:pic>
+                    </a:graphicData>
+                  </a:graphic>
+                </wp:inline>
+              </w:drawing>
+            </w:r>
+          </w:p>
+          <w:p>
+            <w:pPr>
+              <w:jc w:val="center"/>
+            </w:pPr>
+            <w:r>
+              <w:rPr>
+                <w:i/>
+                <w:sz w:val="18"/>
+              </w:rPr>
+              <w:t>Figure 10 – Successful run: all four jobs pass</w:t>
+            </w:r>
+          </w:p>
+        </w:tc>
+        <w:tc>
+          <w:tcPr>
+            <w:tcW w:type="dxa" w:w="5040"/>
+          </w:tcPr>
+          <w:p>
+            <w:pPr>
+              <w:jc w:val="center"/>
+            </w:pPr>
+            <w:r>
+              <w:drawing>
+                <wp:inline xmlns:a="http://schemas.openxmlformats.org/drawingml/2006/main" xmlns:pic="http://schemas.openxmlformats.org/drawingml/2006/picture">
+                  <wp:extent cx="3063240" cy="1608201"/>
+                  <wp:docPr id="11" name="Picture 11"/>
+                  <wp:cNvGraphicFramePr>
+                    <a:graphicFrameLocks noChangeAspect="1"/>
+                  </wp:cNvGraphicFramePr>
+                  <a:graphic>
+                    <a:graphicData uri="http://schemas.openxmlformats.org/drawingml/2006/picture">
+                      <pic:pic>
+                        <pic:nvPicPr>
+                          <pic:cNvPr id="0" name="18_ci_failed_run.png"/>
+                          <pic:cNvPicPr/>
+                        </pic:nvPicPr>
+                        <pic:blipFill>
+                          <a:blip r:embed="rId19"/>
+                          <a:stretch>
+                            <a:fillRect/>
+                          </a:stretch>
+                        </pic:blipFill>
+                        <pic:spPr>
+                          <a:xfrm>
+                            <a:off x="0" y="0"/>
+                            <a:ext cx="3063240" cy="1608201"/>
+                          </a:xfrm>
+                          <a:prstGeom prst="rect"/>
+                        </pic:spPr>
+                      </pic:pic>
+                    </a:graphicData>
+                  </a:graphic>
+                </wp:inline>
+              </w:drawing>
+            </w:r>
+          </w:p>
+          <w:p>
+            <w:pPr>
+              <w:jc w:val="center"/>
+            </w:pPr>
+            <w:r>
+              <w:rPr>
+                <w:i/>
+                <w:sz w:val="18"/>
+              </w:rPr>
+              <w:t>Figure 11 – Failed run: tests fail, train and docker skipped</w:t>
+            </w:r>
+          </w:p>
+        </w:tc>
+      </w:tr>
+    </w:tbl>
     <w:p>
       <w:pPr>
         <w:jc w:val="center"/>
       </w:pPr>
       <w:r>
-        <w:rPr>
-          <w:i/>
-          <w:sz w:val="18"/>
-        </w:rPr>
-        <w:t>Figure 10 – Successful pipeline run: four jobs and test summary</w:t>
-      </w:r>
-    </w:p>
-    <w:p>
-      <w:pPr>
-        <w:jc w:val="center"/>
-      </w:pPr>
-      <w:r>
         <w:drawing>
           <wp:inline xmlns:a="http://schemas.openxmlformats.org/drawingml/2006/main" xmlns:pic="http://schemas.openxmlformats.org/drawingml/2006/picture">
             <wp:extent cx="5120640" cy="1215819"/>
-            <wp:docPr id="11" name="Picture 11"/>
-            <wp:cNvGraphicFramePr>
-              <a:graphicFrameLocks noChangeAspect="1"/>
-            </wp:cNvGraphicFramePr>
-            <a:graphic>
-              <a:graphicData uri="http://schemas.openxmlformats.org/drawingml/2006/picture">
-                <pic:pic>
-                  <pic:nvPicPr>
-                    <pic:cNvPr id="0" name="image.png"/>
-                    <pic:cNvPicPr/>
-                  </pic:nvPicPr>
-                  <pic:blipFill>
-                    <a:blip r:embed="rId19"/>
-                    <a:stretch>
-                      <a:fillRect/>
-                    </a:stretch>
-                  </pic:blipFill>
-                  <pic:spPr>
-                    <a:xfrm>
-                      <a:off x="0" y="0"/>
-                      <a:ext cx="5120640" cy="1215819"/>
-                    </a:xfrm>
-                    <a:prstGeom prst="rect"/>
-                  </pic:spPr>
-                </pic:pic>
-              </a:graphicData>
-            </a:graphic>
-          </wp:inline>
-        </w:drawing>
-      </w:r>
-    </w:p>
-    <w:p>
-      <w:pPr>
-        <w:jc w:val="center"/>
-      </w:pPr>
-      <w:r>
-        <w:rPr>
-          <w:i/>
-          <w:sz w:val="18"/>
-        </w:rPr>
-        <w:t>Figure 11 – Run summary: model comparison written by the train job</w:t>
-      </w:r>
-    </w:p>
-    <w:p>
-      <w:pPr>
-        <w:jc w:val="center"/>
-      </w:pPr>
-      <w:r>
-        <w:drawing>
-          <wp:inline xmlns:a="http://schemas.openxmlformats.org/drawingml/2006/main" xmlns:pic="http://schemas.openxmlformats.org/drawingml/2006/picture">
-            <wp:extent cx="5120640" cy="1366687"/>
             <wp:docPr id="12" name="Picture 12"/>
             <wp:cNvGraphicFramePr>
               <a:graphicFrameLocks noChangeAspect="1"/>
@@ -3967,6 +4010,57 @@
                   <pic:spPr>
                     <a:xfrm>
                       <a:off x="0" y="0"/>
+                      <a:ext cx="5120640" cy="1215819"/>
+                    </a:xfrm>
+                    <a:prstGeom prst="rect"/>
+                  </pic:spPr>
+                </pic:pic>
+              </a:graphicData>
+            </a:graphic>
+          </wp:inline>
+        </w:drawing>
+      </w:r>
+    </w:p>
+    <w:p>
+      <w:pPr>
+        <w:jc w:val="center"/>
+      </w:pPr>
+      <w:r>
+        <w:rPr>
+          <w:i/>
+          <w:sz w:val="18"/>
+        </w:rPr>
+        <w:t>Figure 12 – Run summary: model comparison written by the train job</w:t>
+      </w:r>
+    </w:p>
+    <w:p>
+      <w:pPr>
+        <w:jc w:val="center"/>
+      </w:pPr>
+      <w:r>
+        <w:drawing>
+          <wp:inline xmlns:a="http://schemas.openxmlformats.org/drawingml/2006/main" xmlns:pic="http://schemas.openxmlformats.org/drawingml/2006/picture">
+            <wp:extent cx="5120640" cy="1366687"/>
+            <wp:docPr id="13" name="Picture 13"/>
+            <wp:cNvGraphicFramePr>
+              <a:graphicFrameLocks noChangeAspect="1"/>
+            </wp:cNvGraphicFramePr>
+            <a:graphic>
+              <a:graphicData uri="http://schemas.openxmlformats.org/drawingml/2006/picture">
+                <pic:pic>
+                  <pic:nvPicPr>
+                    <pic:cNvPr id="0" name="image.png"/>
+                    <pic:cNvPicPr/>
+                  </pic:nvPicPr>
+                  <pic:blipFill>
+                    <a:blip r:embed="rId21"/>
+                    <a:stretch>
+                      <a:fillRect/>
+                    </a:stretch>
+                  </pic:blipFill>
+                  <pic:spPr>
+                    <a:xfrm>
+                      <a:off x="0" y="0"/>
                       <a:ext cx="5120640" cy="1366687"/>
                     </a:xfrm>
                     <a:prstGeom prst="rect"/>
@@ -3987,7 +4081,58 @@
           <w:i/>
           <w:sz w:val="18"/>
         </w:rPr>
-        <w:t>Figure 12 – Artifacts uploaded by the run</w:t>
+        <w:t>Figure 13 – Artifacts uploaded by the run</w:t>
+      </w:r>
+    </w:p>
+    <w:p>
+      <w:pPr>
+        <w:jc w:val="center"/>
+      </w:pPr>
+      <w:r>
+        <w:drawing>
+          <wp:inline xmlns:a="http://schemas.openxmlformats.org/drawingml/2006/main" xmlns:pic="http://schemas.openxmlformats.org/drawingml/2006/picture">
+            <wp:extent cx="5852160" cy="711093"/>
+            <wp:docPr id="14" name="Picture 14"/>
+            <wp:cNvGraphicFramePr>
+              <a:graphicFrameLocks noChangeAspect="1"/>
+            </wp:cNvGraphicFramePr>
+            <a:graphic>
+              <a:graphicData uri="http://schemas.openxmlformats.org/drawingml/2006/picture">
+                <pic:pic>
+                  <pic:nvPicPr>
+                    <pic:cNvPr id="0" name="image.png"/>
+                    <pic:cNvPicPr/>
+                  </pic:nvPicPr>
+                  <pic:blipFill>
+                    <a:blip r:embed="rId22"/>
+                    <a:stretch>
+                      <a:fillRect/>
+                    </a:stretch>
+                  </pic:blipFill>
+                  <pic:spPr>
+                    <a:xfrm>
+                      <a:off x="0" y="0"/>
+                      <a:ext cx="5852160" cy="711093"/>
+                    </a:xfrm>
+                    <a:prstGeom prst="rect"/>
+                  </pic:spPr>
+                </pic:pic>
+              </a:graphicData>
+            </a:graphic>
+          </wp:inline>
+        </w:drawing>
+      </w:r>
+    </w:p>
+    <w:p>
+      <w:pPr>
+        <w:jc w:val="center"/>
+      </w:pPr>
+      <w:r>
+        <w:rPr>
+          <w:i/>
+          <w:sz w:val="18"/>
+        </w:rPr>
+        <w:t>Figure 14 – Log of the failed test step</w:t>
       </w:r>
     </w:p>
     <w:p>
@@ -4135,7 +4280,7 @@
         <w:drawing>
           <wp:inline xmlns:a="http://schemas.openxmlformats.org/drawingml/2006/main" xmlns:pic="http://schemas.openxmlformats.org/drawingml/2006/picture">
             <wp:extent cx="4754880" cy="3317966"/>
-            <wp:docPr id="13" name="Picture 13"/>
+            <wp:docPr id="15" name="Picture 15"/>
             <wp:cNvGraphicFramePr>
               <a:graphicFrameLocks noChangeAspect="1"/>
             </wp:cNvGraphicFramePr>
@@ -4147,7 +4292,7 @@
                     <pic:cNvPicPr/>
                   </pic:nvPicPr>
                   <pic:blipFill>
-                    <a:blip r:embed="rId21"/>
+                    <a:blip r:embed="rId23"/>
                     <a:stretch>
                       <a:fillRect/>
                     </a:stretch>
@@ -4175,7 +4320,7 @@
           <w:i/>
           <w:sz w:val="18"/>
         </w:rPr>
-        <w:t>Figure 13 – docker build / run / ps</w:t>
+        <w:t>Figure 15 – docker build / run / ps</w:t>
       </w:r>
     </w:p>
     <w:p>
@@ -4186,7 +4331,7 @@
         <w:drawing>
           <wp:inline xmlns:a="http://schemas.openxmlformats.org/drawingml/2006/main" xmlns:pic="http://schemas.openxmlformats.org/drawingml/2006/picture">
             <wp:extent cx="5852160" cy="549867"/>
-            <wp:docPr id="14" name="Picture 14"/>
+            <wp:docPr id="16" name="Picture 16"/>
             <wp:cNvGraphicFramePr>
               <a:graphicFrameLocks noChangeAspect="1"/>
             </wp:cNvGraphicFramePr>
@@ -4198,7 +4343,7 @@
                     <pic:cNvPicPr/>
                   </pic:nvPicPr>
                   <pic:blipFill>
-                    <a:blip r:embed="rId22"/>
+                    <a:blip r:embed="rId24"/>
                     <a:stretch>
                       <a:fillRect/>
                     </a:stretch>
@@ -4226,7 +4371,7 @@
           <w:i/>
           <w:sz w:val="18"/>
         </w:rPr>
-        <w:t>Figure 14 – /predict on the container with sample input</w:t>
+        <w:t>Figure 16 – /predict on the container with sample input</w:t>
       </w:r>
     </w:p>
     <w:p>
@@ -4413,7 +4558,7 @@
         <w:drawing>
           <wp:inline xmlns:a="http://schemas.openxmlformats.org/drawingml/2006/main" xmlns:pic="http://schemas.openxmlformats.org/drawingml/2006/picture">
             <wp:extent cx="5120640" cy="1591861"/>
-            <wp:docPr id="15" name="Picture 15"/>
+            <wp:docPr id="17" name="Picture 17"/>
             <wp:cNvGraphicFramePr>
               <a:graphicFrameLocks noChangeAspect="1"/>
             </wp:cNvGraphicFramePr>
@@ -4425,7 +4570,7 @@
                     <pic:cNvPicPr/>
                   </pic:nvPicPr>
                   <pic:blipFill>
-                    <a:blip r:embed="rId23"/>
+                    <a:blip r:embed="rId25"/>
                     <a:stretch>
                       <a:fillRect/>
                     </a:stretch>
@@ -4453,7 +4598,7 @@
           <w:i/>
           <w:sz w:val="18"/>
         </w:rPr>
-        <w:t>Figure 15 – kubectl get all: two running pods and the LoadBalancer service</w:t>
+        <w:t>Figure 17 – kubectl get all: two running pods and the LoadBalancer service</w:t>
       </w:r>
     </w:p>
     <w:p>
@@ -4464,7 +4609,7 @@
         <w:drawing>
           <wp:inline xmlns:a="http://schemas.openxmlformats.org/drawingml/2006/main" xmlns:pic="http://schemas.openxmlformats.org/drawingml/2006/picture">
             <wp:extent cx="5852160" cy="507021"/>
-            <wp:docPr id="16" name="Picture 16"/>
+            <wp:docPr id="18" name="Picture 18"/>
             <wp:cNvGraphicFramePr>
               <a:graphicFrameLocks noChangeAspect="1"/>
             </wp:cNvGraphicFramePr>
@@ -4476,7 +4621,7 @@
                     <pic:cNvPicPr/>
                   </pic:nvPicPr>
                   <pic:blipFill>
-                    <a:blip r:embed="rId24"/>
+                    <a:blip r:embed="rId26"/>
                     <a:stretch>
                       <a:fillRect/>
                     </a:stretch>
@@ -4504,7 +4649,7 @@
           <w:i/>
           <w:sz w:val="18"/>
         </w:rPr>
-        <w:t>Figure 16 – Prediction served through the LoadBalancer (localhost:8080)</w:t>
+        <w:t>Figure 18 – Prediction served through the LoadBalancer (localhost:8080)</w:t>
       </w:r>
     </w:p>
     <w:p>
@@ -4596,7 +4741,7 @@
         <w:drawing>
           <wp:inline xmlns:a="http://schemas.openxmlformats.org/drawingml/2006/main" xmlns:pic="http://schemas.openxmlformats.org/drawingml/2006/picture">
             <wp:extent cx="5120640" cy="1906905"/>
-            <wp:docPr id="17" name="Picture 17"/>
+            <wp:docPr id="19" name="Picture 19"/>
             <wp:cNvGraphicFramePr>
               <a:graphicFrameLocks noChangeAspect="1"/>
             </wp:cNvGraphicFramePr>
@@ -4608,7 +4753,7 @@
                     <pic:cNvPicPr/>
                   </pic:nvPicPr>
                   <pic:blipFill>
-                    <a:blip r:embed="rId25"/>
+                    <a:blip r:embed="rId27"/>
                     <a:stretch>
                       <a:fillRect/>
                     </a:stretch>
@@ -4636,7 +4781,7 @@
           <w:i/>
           <w:sz w:val="18"/>
         </w:rPr>
-        <w:t>Figure 17 – Prometheus: both scrape targets (Docker Compose and Kubernetes) UP</w:t>
+        <w:t>Figure 19 – Prometheus: both scrape targets (Docker Compose and Kubernetes) UP</w:t>
       </w:r>
     </w:p>
     <w:p>
@@ -4647,7 +4792,7 @@
         <w:drawing>
           <wp:inline xmlns:a="http://schemas.openxmlformats.org/drawingml/2006/main" xmlns:pic="http://schemas.openxmlformats.org/drawingml/2006/picture">
             <wp:extent cx="4206240" cy="3664362"/>
-            <wp:docPr id="18" name="Picture 18"/>
+            <wp:docPr id="20" name="Picture 20"/>
             <wp:cNvGraphicFramePr>
               <a:graphicFrameLocks noChangeAspect="1"/>
             </wp:cNvGraphicFramePr>
@@ -4659,7 +4804,7 @@
                     <pic:cNvPicPr/>
                   </pic:nvPicPr>
                   <pic:blipFill>
-                    <a:blip r:embed="rId26"/>
+                    <a:blip r:embed="rId28"/>
                     <a:stretch>
                       <a:fillRect/>
                     </a:stretch>
@@ -4687,7 +4832,7 @@
           <w:i/>
           <w:sz w:val="18"/>
         </w:rPr>
-        <w:t>Figure 18 – Grafana dashboard under generated load</w:t>
+        <w:t>Figure 20 – Grafana dashboard under generated load</w:t>
       </w:r>
     </w:p>
     <w:p>

</xml_diff>